<commit_message>
add group 211 prompt information
</commit_message>
<xml_diff>
--- a/MeetingNotes/MeetingMarch23.docx
+++ b/MeetingNotes/MeetingMarch23.docx
@@ -15,13 +15,8 @@
     </w:p>
     <w:p>
       <w:r>
-        <w:t>Monday, March 23</w:t>
-      </w:r>
-      <w:proofErr w:type="gramStart"/>
-      <w:r>
-        <w:t xml:space="preserve"> 2026</w:t>
-      </w:r>
-      <w:proofErr w:type="gramEnd"/>
+        <w:t>Monday, March 23 2026</w:t>
+      </w:r>
     </w:p>
     <w:p/>
     <w:p>
@@ -188,6 +183,144 @@
       </w:r>
       <w:r>
         <w:t xml:space="preserve"> for review and feedback.</w:t>
+      </w:r>
+    </w:p>
+    <w:p/>
+    <w:p>
+      <w:r>
+        <w:t>Meeting with Group 211</w:t>
+      </w:r>
+    </w:p>
+    <w:p>
+      <w:r>
+        <w:t>Summarize the text where a search word came from.</w:t>
+      </w:r>
+    </w:p>
+    <w:p>
+      <w:r>
+        <w:t>Send information (source material)</w:t>
+      </w:r>
+    </w:p>
+    <w:p>
+      <w:r>
+        <w:t>Send summary</w:t>
+      </w:r>
+    </w:p>
+    <w:p>
+      <w:r>
+        <w:tab/>
+        <w:t>Pass pdf document (actual file not link, might have highlighting, and command</w:t>
+      </w:r>
+    </w:p>
+    <w:p>
+      <w:r>
+        <w:tab/>
+        <w:t>Highlight words, page numbers?</w:t>
+      </w:r>
+    </w:p>
+    <w:p>
+      <w:r>
+        <w:lastRenderedPageBreak/>
+        <w:tab/>
+        <w:t>prompt organize by highlighted words and pages</w:t>
+      </w:r>
+    </w:p>
+    <w:p>
+      <w:r>
+        <w:tab/>
+        <w:t xml:space="preserve">use prompt engineering </w:t>
+      </w:r>
+    </w:p>
+    <w:p/>
+    <w:p>
+      <w:r>
+        <w:t>Highlighted rectangles</w:t>
+      </w:r>
+    </w:p>
+    <w:p>
+      <w:r>
+        <w:tab/>
+        <w:t>keyword_info[]:</w:t>
+      </w:r>
+    </w:p>
+    <w:p>
+      <w:r>
+        <w:tab/>
+      </w:r>
+      <w:r>
+        <w:tab/>
+        <w:t>keyword: string</w:t>
+      </w:r>
+    </w:p>
+    <w:p>
+      <w:r>
+        <w:tab/>
+      </w:r>
+      <w:r>
+        <w:tab/>
+        <w:t>word_locations []</w:t>
+      </w:r>
+    </w:p>
+    <w:p>
+      <w:r>
+        <w:tab/>
+      </w:r>
+      <w:r>
+        <w:tab/>
+      </w:r>
+      <w:r>
+        <w:tab/>
+        <w:t>separated by page number []</w:t>
+      </w:r>
+    </w:p>
+    <w:p>
+      <w:r>
+        <w:tab/>
+      </w:r>
+      <w:r>
+        <w:tab/>
+      </w:r>
+      <w:r>
+        <w:tab/>
+      </w:r>
+      <w:r>
+        <w:tab/>
+        <w:t>Highlight_locations</w:t>
+      </w:r>
+    </w:p>
+    <w:p>
+      <w:r>
+        <w:t>No destructive to highlight</w:t>
+      </w:r>
+    </w:p>
+    <w:p>
+      <w:r>
+        <w:t>We should extract text the same way</w:t>
+      </w:r>
+    </w:p>
+    <w:p>
+      <w:r>
+        <w:t>Try to get context</w:t>
+      </w:r>
+    </w:p>
+    <w:p>
+      <w:r>
+        <w:t>Text response back</w:t>
+      </w:r>
+    </w:p>
+    <w:p>
+      <w:r>
+        <w:t>Reference where it sources</w:t>
+      </w:r>
+    </w:p>
+    <w:p>
+      <w:r>
+        <w:t>Reference number in response? Date/Time?</w:t>
+      </w:r>
+    </w:p>
+    <w:p>
+      <w:r>
+        <w:t>Iris – glasses name</w:t>
       </w:r>
     </w:p>
     <w:p/>

</xml_diff>